<commit_message>
Stop table 7 publishing country and year instead of revision and footprint
t_gwp_revision() looked up "healthcare_kt" and "value", neither of which
gwp_revision_sensitivity.csv has ever carried, then fell back to columns 0
and 1 - country_consuming and analysis_year. All five rows of table_07.csv
and of table 7 in the Word document of record read "DNK / 2,022", and the
table still looked like a table.

The lookup is by name now, and the positional fallback is gone: a missing
column raises rather than publishing whichever column sits in that position.
The five values match 15_gwp_revision/gwp_revision_sensitivity.csv exactly.

Table 12's caption claimed the like-for-like share of the regional target is
27 %, which is the B1G every-region variant the study reports as an upper
bound. The table's own rows give 19.7 % with the Danish grid pathway and
15.4 % for the interventions alone. The caption reads both out of the table
now, so it cannot drift from the rows it describes.
</commit_message>
<xml_diff>
--- a/docs/revision/tables_of_record.docx
+++ b/docs/revision/tables_of_record.docx
@@ -4010,7 +4010,7 @@
                 <w:rFonts w:ascii="Calibri" w:hAnsi="Calibri"/>
                 <w:sz w:val="18"/>
               </w:rPr>
-              <w:t>DNK</w:t>
+              <w:t>IPCC SAR (1995)</w:t>
             </w:r>
           </w:p>
         </w:tc>
@@ -4027,7 +4027,7 @@
                 <w:rFonts w:ascii="Calibri" w:hAnsi="Calibri"/>
                 <w:sz w:val="18"/>
               </w:rPr>
-              <w:t>2,022</w:t>
+              <w:t>3,703.5</w:t>
             </w:r>
           </w:p>
         </w:tc>
@@ -4043,7 +4043,7 @@
                 <w:rFonts w:ascii="Calibri" w:hAnsi="Calibri"/>
                 <w:sz w:val="18"/>
               </w:rPr>
-              <w:t>DNK</w:t>
+              <w:t>IPCC TAR (2001)</w:t>
             </w:r>
           </w:p>
         </w:tc>
@@ -4060,7 +4060,7 @@
                 <w:rFonts w:ascii="Calibri" w:hAnsi="Calibri"/>
                 <w:sz w:val="18"/>
               </w:rPr>
-              <w:t>2,022</w:t>
+              <w:t>3,753.7</w:t>
             </w:r>
           </w:p>
         </w:tc>
@@ -4076,7 +4076,7 @@
                 <w:rFonts w:ascii="Calibri" w:hAnsi="Calibri"/>
                 <w:sz w:val="18"/>
               </w:rPr>
-              <w:t>DNK</w:t>
+              <w:t>IPCC AR4 (2007)</w:t>
             </w:r>
           </w:p>
         </w:tc>
@@ -4093,7 +4093,7 @@
                 <w:rFonts w:ascii="Calibri" w:hAnsi="Calibri"/>
                 <w:sz w:val="18"/>
               </w:rPr>
-              <w:t>2,022</w:t>
+              <w:t>3,818.4</w:t>
             </w:r>
           </w:p>
         </w:tc>
@@ -4109,7 +4109,7 @@
                 <w:rFonts w:ascii="Calibri" w:hAnsi="Calibri"/>
                 <w:sz w:val="18"/>
               </w:rPr>
-              <w:t>DNK</w:t>
+              <w:t>IPCC AR5 (2013)</w:t>
             </w:r>
           </w:p>
         </w:tc>
@@ -4126,7 +4126,7 @@
                 <w:rFonts w:ascii="Calibri" w:hAnsi="Calibri"/>
                 <w:sz w:val="18"/>
               </w:rPr>
-              <w:t>2,022</w:t>
+              <w:t>3,918.1</w:t>
             </w:r>
           </w:p>
         </w:tc>
@@ -4142,7 +4142,7 @@
                 <w:rFonts w:ascii="Calibri" w:hAnsi="Calibri"/>
                 <w:sz w:val="18"/>
               </w:rPr>
-              <w:t>DNK</w:t>
+              <w:t>IPCC AR6 (2021)</w:t>
             </w:r>
           </w:p>
         </w:tc>
@@ -4159,7 +4159,7 @@
                 <w:rFonts w:ascii="Calibri" w:hAnsi="Calibri"/>
                 <w:sz w:val="18"/>
               </w:rPr>
-              <w:t>2,022</w:t>
+              <w:t>3,906.4</w:t>
             </w:r>
           </w:p>
         </w:tc>
@@ -6548,7 +6548,7 @@
           <w:color w:val="C1502E"/>
           <w:sz w:val="18"/>
         </w:rPr>
-        <w:t>Supersedes. An earlier figure of 31 % of the target came from summing climate-only levers with the grid pathway folded in unannounced. The like-for-like value is 27 %; the interventions alone reach 15 %.</w:t>
+        <w:t>Supersedes. An earlier figure of 31 % of the target came from summing climate-only levers with the grid pathway folded in unannounced. The like-for-like value is 19.7 %, which this table states as a row of its own, and the interventions alone reach 15.4 %. A caption of 27 % also circulates: that is the B1G variant, which applies the Danish grid trajectory to every region's grid and is reported as an upper bound rather than an evidenced pathway.</w:t>
       </w:r>
     </w:p>
     <w:p>

</xml_diff>

<commit_message>
Record the audit at 20 of 20 with the eight variants in place
C16 was failing only because the new variant folders were untracked; with them
committed the whole audit passes. The tables-of-record workbook is rebuilt so
its table 1 cites 01_eriksen_replication/2022c rather than the folder name that
no longer exists, and the manifest re-hashes the audit's own output.
</commit_message>
<xml_diff>
--- a/docs/revision/tables_of_record.docx
+++ b/docs/revision/tables_of_record.docx
@@ -37,7 +37,7 @@
           <w:color w:val="6B7F7B"/>
           <w:sz w:val="18"/>
         </w:rPr>
-        <w:t>Model: EXIOBASE v3.8.2 IOT_2022_ixi with Danish sea-transport reallocation (Rørmose Jensen &amp; Iliev 2022)</w:t>
+        <w:t>Model: EXIOBASE v3.8.2 IOT_2022_ixi</w:t>
         <w:br/>
         <w:t>Generated: 2026-09-11</w:t>
         <w:br/>
@@ -221,7 +221,7 @@
                 <w:rFonts w:ascii="Calibri" w:hAnsi="Calibri"/>
                 <w:sz w:val="18"/>
               </w:rPr>
-              <w:t>95.4</w:t>
+              <w:t>97.6</w:t>
             </w:r>
           </w:p>
         </w:tc>
@@ -238,7 +238,7 @@
                 <w:rFonts w:ascii="Calibri" w:hAnsi="Calibri"/>
                 <w:sz w:val="18"/>
               </w:rPr>
-              <w:t>16.3</w:t>
+              <w:t>16.6</w:t>
             </w:r>
           </w:p>
         </w:tc>
@@ -272,7 +272,7 @@
                 <w:rFonts w:ascii="Calibri" w:hAnsi="Calibri"/>
                 <w:sz w:val="18"/>
               </w:rPr>
-              <w:t>7.5</w:t>
+              <w:t>7.6</w:t>
             </w:r>
           </w:p>
         </w:tc>
@@ -319,7 +319,7 @@
                 <w:rFonts w:ascii="Calibri" w:hAnsi="Calibri"/>
                 <w:sz w:val="18"/>
               </w:rPr>
-              <w:t>4,675.5</w:t>
+              <w:t>6,087.3</w:t>
             </w:r>
           </w:p>
         </w:tc>
@@ -336,7 +336,7 @@
                 <w:rFonts w:ascii="Calibri" w:hAnsi="Calibri"/>
                 <w:sz w:val="18"/>
               </w:rPr>
-              <w:t>796.0</w:t>
+              <w:t>1,036.4</w:t>
             </w:r>
           </w:p>
         </w:tc>
@@ -370,7 +370,7 @@
                 <w:rFonts w:ascii="Calibri" w:hAnsi="Calibri"/>
                 <w:sz w:val="18"/>
               </w:rPr>
-              <w:t>6.1</w:t>
+              <w:t>7.9</w:t>
             </w:r>
           </w:p>
         </w:tc>
@@ -417,7 +417,7 @@
                 <w:rFonts w:ascii="Calibri" w:hAnsi="Calibri"/>
                 <w:sz w:val="18"/>
               </w:rPr>
-              <w:t>4,851.8</w:t>
+              <w:t>4,990.7</w:t>
             </w:r>
           </w:p>
         </w:tc>
@@ -434,7 +434,7 @@
                 <w:rFonts w:ascii="Calibri" w:hAnsi="Calibri"/>
                 <w:sz w:val="18"/>
               </w:rPr>
-              <w:t>826.1</w:t>
+              <w:t>849.7</w:t>
             </w:r>
           </w:p>
         </w:tc>
@@ -468,7 +468,7 @@
                 <w:rFonts w:ascii="Calibri" w:hAnsi="Calibri"/>
                 <w:sz w:val="18"/>
               </w:rPr>
-              <w:t>4.9</w:t>
+              <w:t>5.0</w:t>
             </w:r>
           </w:p>
         </w:tc>
@@ -515,7 +515,7 @@
                 <w:rFonts w:ascii="Calibri" w:hAnsi="Calibri"/>
                 <w:sz w:val="18"/>
               </w:rPr>
-              <w:t>4,257.2</w:t>
+              <w:t>4,341.8</w:t>
             </w:r>
           </w:p>
         </w:tc>
@@ -532,7 +532,7 @@
                 <w:rFonts w:ascii="Calibri" w:hAnsi="Calibri"/>
                 <w:sz w:val="18"/>
               </w:rPr>
-              <w:t>724.8</w:t>
+              <w:t>739.2</w:t>
             </w:r>
           </w:p>
         </w:tc>
@@ -566,7 +566,7 @@
                 <w:rFonts w:ascii="Calibri" w:hAnsi="Calibri"/>
                 <w:sz w:val="18"/>
               </w:rPr>
-              <w:t>7.9</w:t>
+              <w:t>8.1</w:t>
             </w:r>
           </w:p>
         </w:tc>
@@ -613,7 +613,7 @@
                 <w:rFonts w:ascii="Calibri" w:hAnsi="Calibri"/>
                 <w:sz w:val="18"/>
               </w:rPr>
-              <w:t>259.3</w:t>
+              <w:t>264.7</w:t>
             </w:r>
           </w:p>
         </w:tc>
@@ -630,7 +630,7 @@
                 <w:rFonts w:ascii="Calibri" w:hAnsi="Calibri"/>
                 <w:sz w:val="18"/>
               </w:rPr>
-              <w:t>44.1</w:t>
+              <w:t>45.1</w:t>
             </w:r>
           </w:p>
         </w:tc>
@@ -664,7 +664,7 @@
                 <w:rFonts w:ascii="Calibri" w:hAnsi="Calibri"/>
                 <w:sz w:val="18"/>
               </w:rPr>
-              <w:t>2.4</w:t>
+              <w:t>2.5</w:t>
             </w:r>
           </w:p>
         </w:tc>
@@ -695,7 +695,7 @@
           <w:color w:val="6B7F7B"/>
           <w:sz w:val="17"/>
         </w:rPr>
-        <w:t>Source. 01_eriksen_replication/2022_shipping_corrected/figure1_activity_contributions.csv and 00_core_footprint/national_totals_summary.csv</w:t>
+        <w:t>Source. 01_eriksen_replication/2022_uncorrected/figure1_activity_contributions.csv and 00_core_footprint/national_totals_summary.csv</w:t>
       </w:r>
     </w:p>
     <w:p/>
@@ -2321,7 +2321,7 @@
                 <w:rFonts w:ascii="Calibri" w:hAnsi="Calibri"/>
                 <w:sz w:val="18"/>
               </w:rPr>
-              <w:t>95.30</w:t>
+              <w:t>97.45</w:t>
             </w:r>
           </w:p>
         </w:tc>
@@ -2355,7 +2355,7 @@
                 <w:rFonts w:ascii="Calibri" w:hAnsi="Calibri"/>
                 <w:sz w:val="18"/>
               </w:rPr>
-              <w:t>95.45</w:t>
+              <w:t>97.59</w:t>
             </w:r>
           </w:p>
         </w:tc>
@@ -2436,7 +2436,7 @@
                 <w:rFonts w:ascii="Calibri" w:hAnsi="Calibri"/>
                 <w:sz w:val="18"/>
               </w:rPr>
-              <w:t>4,206.60</w:t>
+              <w:t>5,618.46</w:t>
             </w:r>
           </w:p>
         </w:tc>
@@ -2470,7 +2470,7 @@
                 <w:rFonts w:ascii="Calibri" w:hAnsi="Calibri"/>
                 <w:sz w:val="18"/>
               </w:rPr>
-              <w:t>4,673.63</w:t>
+              <w:t>6,085.49</w:t>
             </w:r>
           </w:p>
         </w:tc>
@@ -2551,7 +2551,7 @@
                 <w:rFonts w:ascii="Calibri" w:hAnsi="Calibri"/>
                 <w:sz w:val="18"/>
               </w:rPr>
-              <w:t>4,851.07</w:t>
+              <w:t>4,989.95</w:t>
             </w:r>
           </w:p>
         </w:tc>
@@ -2585,7 +2585,7 @@
                 <w:rFonts w:ascii="Calibri" w:hAnsi="Calibri"/>
                 <w:sz w:val="18"/>
               </w:rPr>
-              <w:t>4,851.83</w:t>
+              <w:t>4,990.71</w:t>
             </w:r>
           </w:p>
         </w:tc>
@@ -2666,7 +2666,7 @@
                 <w:rFonts w:ascii="Calibri" w:hAnsi="Calibri"/>
                 <w:sz w:val="18"/>
               </w:rPr>
-              <w:t>4,246.25</w:t>
+              <w:t>4,330.93</w:t>
             </w:r>
           </w:p>
         </w:tc>
@@ -2700,7 +2700,7 @@
                 <w:rFonts w:ascii="Calibri" w:hAnsi="Calibri"/>
                 <w:sz w:val="18"/>
               </w:rPr>
-              <w:t>4,257.17</w:t>
+              <w:t>4,341.84</w:t>
             </w:r>
           </w:p>
         </w:tc>
@@ -2781,7 +2781,7 @@
                 <w:rFonts w:ascii="Calibri" w:hAnsi="Calibri"/>
                 <w:sz w:val="18"/>
               </w:rPr>
-              <w:t>213.57</w:t>
+              <w:t>219.03</w:t>
             </w:r>
           </w:p>
         </w:tc>
@@ -2815,7 +2815,7 @@
                 <w:rFonts w:ascii="Calibri" w:hAnsi="Calibri"/>
                 <w:sz w:val="18"/>
               </w:rPr>
-              <w:t>256.80</w:t>
+              <w:t>262.26</w:t>
             </w:r>
           </w:p>
         </w:tc>
@@ -2846,7 +2846,7 @@
           <w:color w:val="6B7F7B"/>
           <w:sz w:val="17"/>
         </w:rPr>
-        <w:t>Source. 02_scopes_wood_hertwich/2022_shipping_corrected/scopes_summary_detailed.csv</w:t>
+        <w:t>Source. 02_scopes_wood_hertwich/2022_uncorrected/scopes_summary_detailed.csv</w:t>
       </w:r>
     </w:p>
     <w:p/>

</xml_diff>